<commit_message>
Auto Update Lottery Data
</commit_message>
<xml_diff>
--- a/最新開獎紀錄.docx
+++ b/最新開獎紀錄.docx
@@ -2697,7 +2697,7 @@
               <w:rPr>
                 <w:sz w:val="24"/>
               </w:rPr>
-              <w:t>07/24(五)</w:t>
+              <w:t>07/25(六)</w:t>
             </w:r>
           </w:p>
         </w:tc>
@@ -2719,7 +2719,7 @@
               <w:rPr>
                 <w:sz w:val="24"/>
               </w:rPr>
-              <w:t>3  1  0  8</w:t>
+              <w:t>9  0  4  8</w:t>
             </w:r>
           </w:p>
         </w:tc>
@@ -2745,7 +2745,7 @@
               <w:rPr>
                 <w:sz w:val="24"/>
               </w:rPr>
-              <w:t>07/25(六)</w:t>
+              <w:t>07/27(一)</w:t>
             </w:r>
           </w:p>
         </w:tc>
@@ -2766,7 +2766,7 @@
               <w:rPr>
                 <w:sz w:val="24"/>
               </w:rPr>
-              <w:t>9  0  4  8</w:t>
+              <w:t>5  9  1  0</w:t>
             </w:r>
           </w:p>
         </w:tc>
@@ -2792,7 +2792,7 @@
               <w:rPr>
                 <w:sz w:val="24"/>
               </w:rPr>
-              <w:t>07/27(一)</w:t>
+              <w:t>07/28(二)</w:t>
             </w:r>
           </w:p>
         </w:tc>
@@ -2813,7 +2813,7 @@
               <w:rPr>
                 <w:sz w:val="24"/>
               </w:rPr>
-              <w:t>5  9  1  0</w:t>
+              <w:t>0  4  3  3</w:t>
             </w:r>
           </w:p>
         </w:tc>
@@ -2839,7 +2839,7 @@
               <w:rPr>
                 <w:sz w:val="24"/>
               </w:rPr>
-              <w:t>07/28(二)</w:t>
+              <w:t>07/29(三)</w:t>
             </w:r>
           </w:p>
         </w:tc>
@@ -2860,7 +2860,7 @@
               <w:rPr>
                 <w:sz w:val="24"/>
               </w:rPr>
-              <w:t>0  4  3  3</w:t>
+              <w:t>7  6  8  5</w:t>
             </w:r>
           </w:p>
         </w:tc>
@@ -2886,7 +2886,7 @@
               <w:rPr>
                 <w:sz w:val="24"/>
               </w:rPr>
-              <w:t>07/29(三)</w:t>
+              <w:t>07/30(四)</w:t>
             </w:r>
           </w:p>
         </w:tc>
@@ -2907,7 +2907,7 @@
               <w:rPr>
                 <w:sz w:val="24"/>
               </w:rPr>
-              <w:t>7  6  8  5</w:t>
+              <w:t>2  9  3  1</w:t>
             </w:r>
           </w:p>
         </w:tc>
@@ -2933,7 +2933,7 @@
               <w:rPr>
                 <w:sz w:val="24"/>
               </w:rPr>
-              <w:t>07/30(四)</w:t>
+              <w:t>07/31(五)</w:t>
             </w:r>
           </w:p>
         </w:tc>
@@ -2954,7 +2954,7 @@
               <w:rPr>
                 <w:sz w:val="24"/>
               </w:rPr>
-              <w:t>2  9  3  1</w:t>
+              <w:t>7  1  9  8</w:t>
             </w:r>
           </w:p>
         </w:tc>
@@ -2980,7 +2980,7 @@
               <w:rPr>
                 <w:sz w:val="24"/>
               </w:rPr>
-              <w:t>07/31(五)</w:t>
+              <w:t>08/01(六)</w:t>
             </w:r>
           </w:p>
         </w:tc>
@@ -3001,7 +3001,7 @@
               <w:rPr>
                 <w:sz w:val="24"/>
               </w:rPr>
-              <w:t>7  1  9  8</w:t>
+              <w:t>7  1  9  5</w:t>
             </w:r>
           </w:p>
         </w:tc>
@@ -3027,7 +3027,7 @@
               <w:rPr>
                 <w:sz w:val="24"/>
               </w:rPr>
-              <w:t>08/01(六)</w:t>
+              <w:t>08/03(一)</w:t>
             </w:r>
           </w:p>
         </w:tc>
@@ -3048,7 +3048,7 @@
               <w:rPr>
                 <w:sz w:val="24"/>
               </w:rPr>
-              <w:t>7  1  9  5</w:t>
+              <w:t>6  0  1  6</w:t>
             </w:r>
           </w:p>
         </w:tc>
@@ -3074,7 +3074,7 @@
               <w:rPr>
                 <w:sz w:val="24"/>
               </w:rPr>
-              <w:t>08/03(一)</w:t>
+              <w:t>08/04(二)</w:t>
             </w:r>
           </w:p>
         </w:tc>
@@ -3095,7 +3095,7 @@
               <w:rPr>
                 <w:sz w:val="24"/>
               </w:rPr>
-              <w:t>6  0  1  6</w:t>
+              <w:t>1  8  4  3</w:t>
             </w:r>
           </w:p>
         </w:tc>
@@ -3121,7 +3121,7 @@
               <w:rPr>
                 <w:sz w:val="24"/>
               </w:rPr>
-              <w:t>08/04(二)</w:t>
+              <w:t>08/05(三)</w:t>
             </w:r>
           </w:p>
         </w:tc>
@@ -3142,7 +3142,7 @@
               <w:rPr>
                 <w:sz w:val="24"/>
               </w:rPr>
-              <w:t>1  8  4  3</w:t>
+              <w:t>0  8  2  3</w:t>
             </w:r>
           </w:p>
         </w:tc>

</xml_diff>